<commit_message>
docs: 量表功能写入README/技术报告 + Dockerfile复制data/scales/
</commit_message>
<xml_diff>
--- a/第八届开源大赛技术报告.docx
+++ b/第八届开源大赛技术报告.docx
@@ -3136,6 +3136,55 @@
           <w:sz w:val="24"/>
         </w:rPr>
         <w:t>前端采用Vue 3 Composition API + Vite构建，6个页面：仪表盘（3个指标卡片+7日趋势图+预警分布+最近记录+系统控制）、情绪监测、预警面板（列表+筛选+确认）、学生详情（完整心理档案）、AIGC报告（生成+查看）、智能体面板（5Agent状态+SSE流式窗口）、视频上传。使用ECharts进行可视化，SSE（Server-Sent Events）实现Agent协作过程实时流式展示。每个页面右下角有用户反馈浮窗（星级评分+文字反馈）。</w:t>
+      </w:r>
+    </w:p>
+    <w:p>
+      <w:pPr>
+        <w:pStyle w:val="Heading2"/>
+      </w:pPr>
+      <w:r>
+        <w:rPr>
+          <w:rFonts w:eastAsia="黑体"/>
+          <w:sz w:val="28"/>
+          <w:b/>
+        </w:rPr>
+        <w:t xml:space="preserve">2.9 心理量表自评与AI交叉验证</w:t>
+      </w:r>
+    </w:p>
+    <w:p>
+      <w:r>
+        <w:rPr>
+          <w:rFonts w:eastAsia="宋体"/>
+          <w:sz w:val="24"/>
+        </w:rPr>
+        <w:t xml:space="preserve">为弥补纯AI情绪识别在效度验证方面的不足，系统内置了三套国际标准化心理量表——SAS（焦虑自评量表，Zung 1971）、SDS（抑郁自评量表，Zung 1965）和SCL-90（症状自评量表，Derogatis 1975，10维度/90题）。三种量表题目均来源于公开发表学术论文，遵循学术使用规范。</w:t>
+      </w:r>
+    </w:p>
+    <w:p>
+      <w:r>
+        <w:rPr>
+          <w:rFonts w:eastAsia="宋体"/>
+          <w:sz w:val="24"/>
+        </w:rPr>
+        <w:t xml:space="preserve">量表功能由前端自评页面、后端自动计分引擎和数据库ScaleResult表三部分组成。学生通过前端页面完成自评后，系统根据标准计分规则自动计算原始分、标准分（raw×1.25）和等级（正常/轻度/中度/偏重）；SCL-90额外输出10维度因子分。</w:t>
+      </w:r>
+    </w:p>
+    <w:p>
+      <w:r>
+        <w:rPr>
+          <w:rFonts w:eastAsia="宋体"/>
+          <w:sz w:val="24"/>
+        </w:rPr>
+        <w:t xml:space="preserve">AI交叉验证模块（GET /api/scales/crosscheck/{student_id}）将量表结果与学生情绪识别数据对比——例如当SAS标准分≥60且AI平均情绪评分&lt;0.4时判定一致高风险，否则建议复核。AIGC报告自动生成时附带量表参照数据，为AI评估结论提供标准化效度基准。</w:t>
+      </w:r>
+    </w:p>
+    <w:p>
+      <w:r>
+        <w:rPr>
+          <w:rFonts w:eastAsia="宋体"/>
+          <w:sz w:val="24"/>
+        </w:rPr>
+        <w:t xml:space="preserve">预种数据包含每名学生2份量表测评记录（SAS/SDS），确保系统启动后仪表盘和AIGC报告页面有完整数据可展示。</w:t>
       </w:r>
     </w:p>
     <w:p>

</xml_diff>